<commit_message>
NRCS rule & data changes
</commit_message>
<xml_diff>
--- a/NRCS/Requirements/AI_Instructions.docx
+++ b/NRCS/Requirements/AI_Instructions.docx
@@ -603,7 +603,21 @@
           <w:rFonts w:ascii="Segoe UI" w:hAnsi="Segoe UI" w:cs="Segoe UI"/>
           <w:color w:val="121212"/>
         </w:rPr>
-        <w:t>Make sure to allot</w:t>
+        <w:t xml:space="preserve">Make sure </w:t>
+      </w:r>
+      <w:r>
+        <w:rPr>
+          <w:rFonts w:ascii="Segoe UI" w:hAnsi="Segoe UI" w:cs="Segoe UI"/>
+          <w:color w:val="121212"/>
+        </w:rPr>
+        <w:t>not to</w:t>
+      </w:r>
+      <w:r>
+        <w:rPr>
+          <w:rFonts w:ascii="Segoe UI" w:hAnsi="Segoe UI" w:cs="Segoe UI"/>
+          <w:color w:val="121212"/>
+        </w:rPr>
+        <w:t xml:space="preserve"> allot</w:t>
       </w:r>
       <w:r>
         <w:rPr>
@@ -638,7 +652,14 @@
           <w:rFonts w:ascii="Segoe UI" w:hAnsi="Segoe UI" w:cs="Segoe UI"/>
           <w:color w:val="121212"/>
         </w:rPr>
-        <w:t>leisure to Gowtham.</w:t>
+        <w:t>periods</w:t>
+      </w:r>
+      <w:r>
+        <w:rPr>
+          <w:rFonts w:ascii="Segoe UI" w:hAnsi="Segoe UI" w:cs="Segoe UI"/>
+          <w:color w:val="121212"/>
+        </w:rPr>
+        <w:t xml:space="preserve"> to Gowtham.</w:t>
       </w:r>
     </w:p>
     <w:p>

</xml_diff>